<commit_message>
Attempt to fix the worldbuilding.html not showing the placeholder picture
</commit_message>
<xml_diff>
--- a/content/characters/placeholder.docx
+++ b/content/characters/placeholder.docx
@@ -60,7 +60,15 @@
         <w:spacing w:before="240" w:after="240"/>
       </w:pPr>
       <w:r>
-        <w:t>Write relationships here...</w:t>
+        <w:t xml:space="preserve">Bird relationships? </w:t>
+      </w:r>
+      <w:proofErr w:type="gramStart"/>
+      <w:r>
+        <w:t>Write</w:t>
+      </w:r>
+      <w:proofErr w:type="gramEnd"/>
+      <w:r>
+        <w:t xml:space="preserve"> relationships here...</w:t>
       </w:r>
     </w:p>
     <w:p>

</xml_diff>